<commit_message>
Replace test cell render with engineering blueprint
</commit_message>
<xml_diff>
--- a/reports/test_cell_selected_design_basis_2026-09-04/HeiQ_EO_Vapour_Test_Cell_Selected_Design_Basis_2026-09-04.docx
+++ b/reports/test_cell_selected_design_basis_2026-09-04/HeiQ_EO_Vapour_Test_Cell_Selected_Design_Basis_2026-09-04.docx
@@ -186,7 +186,7 @@
       <w:r>
         <w:drawing>
           <wp:inline xmlns:a="http://schemas.openxmlformats.org/drawingml/2006/main" xmlns:pic="http://schemas.openxmlformats.org/drawingml/2006/picture">
-            <wp:extent cx="5903999" cy="3935999"/>
+            <wp:extent cx="6120000" cy="3473655"/>
             <wp:docPr id="1" name="Picture 1"/>
             <wp:cNvGraphicFramePr>
               <a:graphicFrameLocks noChangeAspect="1"/>
@@ -195,7 +195,7 @@
               <a:graphicData uri="http://schemas.openxmlformats.org/drawingml/2006/picture">
                 <pic:pic>
                   <pic:nvPicPr>
-                    <pic:cNvPr id="0" name="eo_vapour_integrated_two_chamber_exterior_render.png"/>
+                    <pic:cNvPr id="0" name="eo_vapour_test_cell_engineering_blueprint.png"/>
                     <pic:cNvPicPr/>
                   </pic:nvPicPr>
                   <pic:blipFill>
@@ -207,7 +207,7 @@
                   <pic:spPr>
                     <a:xfrm>
                       <a:off x="0" y="0"/>
-                      <a:ext cx="5903999" cy="3935999"/>
+                      <a:ext cx="6120000" cy="3473655"/>
                     </a:xfrm>
                     <a:prstGeom prst="rect"/>
                   </pic:spPr>
@@ -228,7 +228,7 @@
           <w:color w:val="475569"/>
           <w:sz w:val="16"/>
         </w:rPr>
-        <w:t>Figure 1. Illustrative integrated two-chamber setup. The image shows the intended architecture, not released CAD or verified internal geometry.</w:t>
+        <w:t>Figure 1. Two-dimensional functional blueprint of the complete test setup. Values and dimensions are kept in the calculation basis; this is not released fabrication CAD.</w:t>
       </w:r>
     </w:p>
     <w:p>

</xml_diff>

<commit_message>
Replace test cell render with engineering blueprint (#7)
</commit_message>
<xml_diff>
--- a/reports/test_cell_selected_design_basis_2026-09-04/HeiQ_EO_Vapour_Test_Cell_Selected_Design_Basis_2026-09-04.docx
+++ b/reports/test_cell_selected_design_basis_2026-09-04/HeiQ_EO_Vapour_Test_Cell_Selected_Design_Basis_2026-09-04.docx
@@ -186,7 +186,7 @@
       <w:r>
         <w:drawing>
           <wp:inline xmlns:a="http://schemas.openxmlformats.org/drawingml/2006/main" xmlns:pic="http://schemas.openxmlformats.org/drawingml/2006/picture">
-            <wp:extent cx="5903999" cy="3935999"/>
+            <wp:extent cx="6120000" cy="3473655"/>
             <wp:docPr id="1" name="Picture 1"/>
             <wp:cNvGraphicFramePr>
               <a:graphicFrameLocks noChangeAspect="1"/>
@@ -195,7 +195,7 @@
               <a:graphicData uri="http://schemas.openxmlformats.org/drawingml/2006/picture">
                 <pic:pic>
                   <pic:nvPicPr>
-                    <pic:cNvPr id="0" name="eo_vapour_integrated_two_chamber_exterior_render.png"/>
+                    <pic:cNvPr id="0" name="eo_vapour_test_cell_engineering_blueprint.png"/>
                     <pic:cNvPicPr/>
                   </pic:nvPicPr>
                   <pic:blipFill>
@@ -207,7 +207,7 @@
                   <pic:spPr>
                     <a:xfrm>
                       <a:off x="0" y="0"/>
-                      <a:ext cx="5903999" cy="3935999"/>
+                      <a:ext cx="6120000" cy="3473655"/>
                     </a:xfrm>
                     <a:prstGeom prst="rect"/>
                   </pic:spPr>
@@ -228,7 +228,7 @@
           <w:color w:val="475569"/>
           <w:sz w:val="16"/>
         </w:rPr>
-        <w:t>Figure 1. Illustrative integrated two-chamber setup. The image shows the intended architecture, not released CAD or verified internal geometry.</w:t>
+        <w:t>Figure 1. Two-dimensional functional blueprint of the complete test setup. Values and dimensions are kept in the calculation basis; this is not released fabrication CAD.</w:t>
       </w:r>
     </w:p>
     <w:p>

</xml_diff>

<commit_message>
Design error-controlled EO test cell
</commit_message>
<xml_diff>
--- a/reports/test_cell_selected_design_basis_2026-09-04/HeiQ_EO_Vapour_Test_Cell_Selected_Design_Basis_2026-09-04.docx
+++ b/reports/test_cell_selected_design_basis_2026-09-04/HeiQ_EO_Vapour_Test_Cell_Selected_Design_Basis_2026-09-04.docx
@@ -186,7 +186,7 @@
       <w:r>
         <w:drawing>
           <wp:inline xmlns:a="http://schemas.openxmlformats.org/drawingml/2006/main" xmlns:pic="http://schemas.openxmlformats.org/drawingml/2006/picture">
-            <wp:extent cx="6120000" cy="3473655"/>
+            <wp:extent cx="6120000" cy="3454504"/>
             <wp:docPr id="1" name="Picture 1"/>
             <wp:cNvGraphicFramePr>
               <a:graphicFrameLocks noChangeAspect="1"/>
@@ -207,7 +207,7 @@
                   <pic:spPr>
                     <a:xfrm>
                       <a:off x="0" y="0"/>
-                      <a:ext cx="6120000" cy="3473655"/>
+                      <a:ext cx="6120000" cy="3454504"/>
                     </a:xfrm>
                     <a:prstGeom prst="rect"/>
                   </pic:spPr>
@@ -858,6 +858,461 @@
         <w:t>Fabrication remains conditional on measured mixing, leakage, fan thermal bias, differential pressure, component displacement, seal performance and assembled net volume.</w:t>
       </w:r>
     </w:p>
+    <w:p>
+      <w:pPr>
+        <w:sectPr>
+          <w:pgSz w:w="11906" w:h="16838"/>
+          <w:pgMar w:top="794" w:right="964" w:bottom="794" w:left="964" w:header="720" w:footer="720" w:gutter="0"/>
+          <w:cols w:space="720"/>
+          <w:docGrid w:linePitch="360"/>
+        </w:sectPr>
+      </w:pPr>
+    </w:p>
+    <w:p>
+      <w:pPr>
+        <w:pStyle w:val="Heading1"/>
+        <w:keepNext/>
+      </w:pPr>
+      <w:r>
+        <w:rPr>
+          <w:color w:val="14304B"/>
+        </w:rPr>
+        <w:t>Error-controlled construction</w:t>
+      </w:r>
+    </w:p>
+    <w:p>
+      <w:r>
+        <w:t>The cell geometry is now tied to an explicit error budget. Calculation is used for stiffness and inventory scaling; physical blanks and scaling tests control effects that cannot be credibly removed by geometry alone.</w:t>
+      </w:r>
+    </w:p>
+    <w:tbl>
+      <w:tblPr>
+        <w:tblStyle w:val="LightShading-Accent1"/>
+        <w:tblW w:type="auto" w:w="0"/>
+        <w:tblLook w:firstColumn="1" w:firstRow="1" w:lastColumn="0" w:lastRow="0" w:noHBand="0" w:noVBand="1" w:val="04A0"/>
+      </w:tblPr>
+      <w:tblGrid>
+        <w:gridCol w:w="4989"/>
+        <w:gridCol w:w="4989"/>
+      </w:tblGrid>
+      <w:tr>
+        <w:trPr>
+          <w:cantSplit/>
+        </w:trPr>
+        <w:tc>
+          <w:tcPr>
+            <w:tcW w:type="dxa" w:w="4989"/>
+            <w:shd w:fill="17304B"/>
+            <w:vAlign w:val="center"/>
+          </w:tcPr>
+          <w:p>
+            <w:pPr>
+              <w:spacing w:after="0"/>
+            </w:pPr>
+            <w:r/>
+            <w:r>
+              <w:rPr>
+                <w:b/>
+                <w:color w:val="FFFFFF"/>
+                <w:sz w:val="17"/>
+              </w:rPr>
+              <w:t>Control</w:t>
+            </w:r>
+          </w:p>
+        </w:tc>
+        <w:tc>
+          <w:tcPr>
+            <w:tcW w:type="dxa" w:w="4989"/>
+            <w:shd w:fill="17304B"/>
+            <w:vAlign w:val="center"/>
+          </w:tcPr>
+          <w:p>
+            <w:pPr>
+              <w:spacing w:after="0"/>
+            </w:pPr>
+            <w:r/>
+            <w:r>
+              <w:rPr>
+                <w:b/>
+                <w:color w:val="FFFFFF"/>
+                <w:sz w:val="17"/>
+              </w:rPr>
+              <w:t>Selected design / acceptance criterion</w:t>
+            </w:r>
+          </w:p>
+        </w:tc>
+      </w:tr>
+      <w:tr>
+        <w:trPr>
+          <w:cantSplit/>
+        </w:trPr>
+        <w:tc>
+          <w:tcPr>
+            <w:tcW w:type="dxa" w:w="4989"/>
+            <w:vAlign w:val="center"/>
+          </w:tcPr>
+          <w:p>
+            <w:pPr>
+              <w:spacing w:after="0"/>
+            </w:pPr>
+            <w:r/>
+            <w:r>
+              <w:rPr>
+                <w:b w:val="0"/>
+                <w:sz w:val="17"/>
+              </w:rPr>
+              <w:t>Structural wall</w:t>
+            </w:r>
+          </w:p>
+        </w:tc>
+        <w:tc>
+          <w:tcPr>
+            <w:tcW w:type="dxa" w:w="4989"/>
+            <w:vAlign w:val="center"/>
+          </w:tcPr>
+          <w:p>
+            <w:pPr>
+              <w:spacing w:after="0"/>
+            </w:pPr>
+            <w:r/>
+            <w:r>
+              <w:rPr>
+                <w:b w:val="0"/>
+                <w:sz w:val="17"/>
+              </w:rPr>
+              <w:t>12 mm EN AW-6082-T6 aluminium; 1.33 µm pressure-only proof deflection.</w:t>
+            </w:r>
+          </w:p>
+        </w:tc>
+      </w:tr>
+      <w:tr>
+        <w:trPr>
+          <w:cantSplit/>
+        </w:trPr>
+        <w:tc>
+          <w:tcPr>
+            <w:tcW w:type="dxa" w:w="4989"/>
+            <w:vAlign w:val="center"/>
+          </w:tcPr>
+          <w:p>
+            <w:pPr>
+              <w:spacing w:after="0"/>
+            </w:pPr>
+            <w:r/>
+            <w:r>
+              <w:rPr>
+                <w:b w:val="0"/>
+                <w:sz w:val="17"/>
+              </w:rPr>
+              <w:t>Insulating plate</w:t>
+            </w:r>
+          </w:p>
+        </w:tc>
+        <w:tc>
+          <w:tcPr>
+            <w:tcW w:type="dxa" w:w="4989"/>
+            <w:vAlign w:val="center"/>
+          </w:tcPr>
+          <w:p>
+            <w:pPr>
+              <w:spacing w:after="0"/>
+            </w:pPr>
+            <w:r/>
+            <w:r>
+              <w:rPr>
+                <w:b w:val="0"/>
+                <w:sz w:val="17"/>
+              </w:rPr>
+              <w:t>20 mm Unfilled PEEK; 4.51 µm pressure-only proof deflection.</w:t>
+            </w:r>
+          </w:p>
+        </w:tc>
+      </w:tr>
+      <w:tr>
+        <w:trPr>
+          <w:cantSplit/>
+        </w:trPr>
+        <w:tc>
+          <w:tcPr>
+            <w:tcW w:type="dxa" w:w="4989"/>
+            <w:vAlign w:val="center"/>
+          </w:tcPr>
+          <w:p>
+            <w:pPr>
+              <w:spacing w:after="0"/>
+            </w:pPr>
+            <w:r/>
+            <w:r>
+              <w:rPr>
+                <w:b w:val="0"/>
+                <w:sz w:val="17"/>
+              </w:rPr>
+              <w:t>Loaded local gap</w:t>
+            </w:r>
+          </w:p>
+        </w:tc>
+        <w:tc>
+          <w:tcPr>
+            <w:tcW w:type="dxa" w:w="4989"/>
+            <w:vAlign w:val="center"/>
+          </w:tcPr>
+          <w:p>
+            <w:pPr>
+              <w:spacing w:after="0"/>
+            </w:pPr>
+            <w:r/>
+            <w:r>
+              <w:rPr>
+                <w:b w:val="0"/>
+                <w:sz w:val="17"/>
+              </w:rPr>
+              <w:t>2.00 ± 0.02 mm with hard stops and a loaded gap map.</w:t>
+            </w:r>
+          </w:p>
+        </w:tc>
+      </w:tr>
+      <w:tr>
+        <w:trPr>
+          <w:cantSplit/>
+        </w:trPr>
+        <w:tc>
+          <w:tcPr>
+            <w:tcW w:type="dxa" w:w="4989"/>
+            <w:vAlign w:val="center"/>
+          </w:tcPr>
+          <w:p>
+            <w:pPr>
+              <w:spacing w:after="0"/>
+            </w:pPr>
+            <w:r/>
+            <w:r>
+              <w:rPr>
+                <w:b w:val="0"/>
+                <w:sz w:val="17"/>
+              </w:rPr>
+              <w:t>Wetted surfaces</w:t>
+            </w:r>
+          </w:p>
+        </w:tc>
+        <w:tc>
+          <w:tcPr>
+            <w:tcW w:type="dxa" w:w="4989"/>
+            <w:vAlign w:val="center"/>
+          </w:tcPr>
+          <w:p>
+            <w:pPr>
+              <w:spacing w:after="0"/>
+            </w:pPr>
+            <w:r/>
+            <w:r>
+              <w:rPr>
+                <w:b w:val="0"/>
+                <w:sz w:val="17"/>
+              </w:rPr>
+              <w:t>Smooth removable non-porous metal liners; exposed PEEK restricted to the insulating cartridge land.</w:t>
+            </w:r>
+          </w:p>
+        </w:tc>
+      </w:tr>
+      <w:tr>
+        <w:trPr>
+          <w:cantSplit/>
+        </w:trPr>
+        <w:tc>
+          <w:tcPr>
+            <w:tcW w:type="dxa" w:w="4989"/>
+            <w:vAlign w:val="center"/>
+          </w:tcPr>
+          <w:p>
+            <w:pPr>
+              <w:spacing w:after="0"/>
+            </w:pPr>
+            <w:r/>
+            <w:r>
+              <w:rPr>
+                <w:b w:val="0"/>
+                <w:sz w:val="17"/>
+              </w:rPr>
+              <w:t>Edge effect</w:t>
+            </w:r>
+          </w:p>
+        </w:tc>
+        <w:tc>
+          <w:tcPr>
+            <w:tcW w:type="dxa" w:w="4989"/>
+            <w:vAlign w:val="center"/>
+          </w:tcPr>
+          <w:p>
+            <w:pPr>
+              <w:spacing w:after="0"/>
+            </w:pPr>
+            <w:r/>
+            <w:r>
+              <w:rPr>
+                <w:b w:val="0"/>
+                <w:sz w:val="17"/>
+              </w:rPr>
+              <w:t>Primary 50 mm aperture plus 30/40/50 mm area–perimeter regression. A 1 mm band is already 7.84% of active area.</w:t>
+            </w:r>
+          </w:p>
+        </w:tc>
+      </w:tr>
+      <w:tr>
+        <w:trPr>
+          <w:cantSplit/>
+        </w:trPr>
+        <w:tc>
+          <w:tcPr>
+            <w:tcW w:type="dxa" w:w="4989"/>
+            <w:vAlign w:val="center"/>
+          </w:tcPr>
+          <w:p>
+            <w:pPr>
+              <w:spacing w:after="0"/>
+            </w:pPr>
+            <w:r/>
+            <w:r>
+              <w:rPr>
+                <w:b w:val="0"/>
+                <w:sz w:val="17"/>
+              </w:rPr>
+              <w:t>Wall-storage blank</w:t>
+            </w:r>
+          </w:p>
+        </w:tc>
+        <w:tc>
+          <w:tcPr>
+            <w:tcW w:type="dxa" w:w="4989"/>
+            <w:vAlign w:val="center"/>
+          </w:tcPr>
+          <w:p>
+            <w:pPr>
+              <w:spacing w:after="0"/>
+            </w:pPr>
+            <w:r/>
+            <w:r>
+              <w:rPr>
+                <w:b w:val="0"/>
+                <w:sz w:val="17"/>
+              </w:rPr>
+              <w:t>≤ 0.01733 mg per segment, equivalent to 0.256 nm reversible water film.</w:t>
+            </w:r>
+          </w:p>
+        </w:tc>
+      </w:tr>
+      <w:tr>
+        <w:trPr>
+          <w:cantSplit/>
+        </w:trPr>
+        <w:tc>
+          <w:tcPr>
+            <w:tcW w:type="dxa" w:w="4989"/>
+            <w:vAlign w:val="center"/>
+          </w:tcPr>
+          <w:p>
+            <w:pPr>
+              <w:spacing w:after="0"/>
+            </w:pPr>
+            <w:r/>
+            <w:r>
+              <w:rPr>
+                <w:b w:val="0"/>
+                <w:sz w:val="17"/>
+              </w:rPr>
+              <w:t>Sensors / mixing</w:t>
+            </w:r>
+          </w:p>
+        </w:tc>
+        <w:tc>
+          <w:tcPr>
+            <w:tcW w:type="dxa" w:w="4989"/>
+            <w:vAlign w:val="center"/>
+          </w:tcPr>
+          <w:p>
+            <w:pPr>
+              <w:spacing w:after="0"/>
+            </w:pPr>
+            <w:r/>
+            <w:r>
+              <w:rPr>
+                <w:b w:val="0"/>
+                <w:sz w:val="17"/>
+              </w:rPr>
+              <w:t>2 T/RH locations per chamber; relative calibration ≤ 0.10 RH point and spatial disagreement ≤ 0.15 RH point.</w:t>
+            </w:r>
+          </w:p>
+        </w:tc>
+      </w:tr>
+      <w:tr>
+        <w:trPr>
+          <w:cantSplit/>
+        </w:trPr>
+        <w:tc>
+          <w:tcPr>
+            <w:tcW w:type="dxa" w:w="4989"/>
+            <w:vAlign w:val="center"/>
+          </w:tcPr>
+          <w:p>
+            <w:pPr>
+              <w:spacing w:after="0"/>
+            </w:pPr>
+            <w:r/>
+            <w:r>
+              <w:rPr>
+                <w:b w:val="0"/>
+                <w:sz w:val="17"/>
+              </w:rPr>
+              <w:t>State / leakage</w:t>
+            </w:r>
+          </w:p>
+        </w:tc>
+        <w:tc>
+          <w:tcPr>
+            <w:tcW w:type="dxa" w:w="4989"/>
+            <w:vAlign w:val="center"/>
+          </w:tcPr>
+          <w:p>
+            <w:pPr>
+              <w:spacing w:after="0"/>
+            </w:pPr>
+            <w:r/>
+            <w:r>
+              <w:rPr>
+                <w:b w:val="0"/>
+                <w:sz w:val="17"/>
+              </w:rPr>
+              <w:t>Chamber ΔT ≤ 0.05 K; volume uncertainty ≤ 1.0 mL; cross-leak screen ≤ 6.25 mL/min at peak RH difference.</w:t>
+            </w:r>
+          </w:p>
+        </w:tc>
+      </w:tr>
+    </w:tbl>
+    <w:p>
+      <w:pPr>
+        <w:pStyle w:val="Heading1"/>
+        <w:keepNext/>
+      </w:pPr>
+      <w:r>
+        <w:rPr>
+          <w:color w:val="14304B"/>
+        </w:rPr>
+        <w:t>Acceptance logic</w:t>
+      </w:r>
+    </w:p>
+    <w:p>
+      <w:r>
+        <w:t>The planning root-sum-square allocation is 3.36% of the corrected segment signal. This is not demonstrated accuracy. Accept data only after individual volume calibration, pressure-decay and guard-leak testing, an impermeable-coupon wall/thermal blank, a zero-current diffusion blank, three-aperture edge regression, spatial mixing verification and post-run drift checks.</w:t>
+      </w:r>
+    </w:p>
+    <w:p>
+      <w:r>
+        <w:rPr>
+          <w:b/>
+          <w:color w:val="D97706"/>
+        </w:rPr>
+        <w:t>Wall thickness cannot eliminate membrane-edge transport or reversible water storage. These are controlled by the liner, guard, blanks and aperture regression.</w:t>
+      </w:r>
+    </w:p>
     <w:sectPr>
       <w:pgSz w:w="11906" w:h="16838"/>
       <w:pgMar w:top="794" w:right="964" w:bottom="794" w:left="964" w:header="720" w:footer="720" w:gutter="0"/>

</xml_diff>

<commit_message>
Design error-controlled EO test cell (#8)
</commit_message>
<xml_diff>
--- a/reports/test_cell_selected_design_basis_2026-09-04/HeiQ_EO_Vapour_Test_Cell_Selected_Design_Basis_2026-09-04.docx
+++ b/reports/test_cell_selected_design_basis_2026-09-04/HeiQ_EO_Vapour_Test_Cell_Selected_Design_Basis_2026-09-04.docx
@@ -186,7 +186,7 @@
       <w:r>
         <w:drawing>
           <wp:inline xmlns:a="http://schemas.openxmlformats.org/drawingml/2006/main" xmlns:pic="http://schemas.openxmlformats.org/drawingml/2006/picture">
-            <wp:extent cx="6120000" cy="3473655"/>
+            <wp:extent cx="6120000" cy="3454504"/>
             <wp:docPr id="1" name="Picture 1"/>
             <wp:cNvGraphicFramePr>
               <a:graphicFrameLocks noChangeAspect="1"/>
@@ -207,7 +207,7 @@
                   <pic:spPr>
                     <a:xfrm>
                       <a:off x="0" y="0"/>
-                      <a:ext cx="6120000" cy="3473655"/>
+                      <a:ext cx="6120000" cy="3454504"/>
                     </a:xfrm>
                     <a:prstGeom prst="rect"/>
                   </pic:spPr>
@@ -858,6 +858,461 @@
         <w:t>Fabrication remains conditional on measured mixing, leakage, fan thermal bias, differential pressure, component displacement, seal performance and assembled net volume.</w:t>
       </w:r>
     </w:p>
+    <w:p>
+      <w:pPr>
+        <w:sectPr>
+          <w:pgSz w:w="11906" w:h="16838"/>
+          <w:pgMar w:top="794" w:right="964" w:bottom="794" w:left="964" w:header="720" w:footer="720" w:gutter="0"/>
+          <w:cols w:space="720"/>
+          <w:docGrid w:linePitch="360"/>
+        </w:sectPr>
+      </w:pPr>
+    </w:p>
+    <w:p>
+      <w:pPr>
+        <w:pStyle w:val="Heading1"/>
+        <w:keepNext/>
+      </w:pPr>
+      <w:r>
+        <w:rPr>
+          <w:color w:val="14304B"/>
+        </w:rPr>
+        <w:t>Error-controlled construction</w:t>
+      </w:r>
+    </w:p>
+    <w:p>
+      <w:r>
+        <w:t>The cell geometry is now tied to an explicit error budget. Calculation is used for stiffness and inventory scaling; physical blanks and scaling tests control effects that cannot be credibly removed by geometry alone.</w:t>
+      </w:r>
+    </w:p>
+    <w:tbl>
+      <w:tblPr>
+        <w:tblStyle w:val="LightShading-Accent1"/>
+        <w:tblW w:type="auto" w:w="0"/>
+        <w:tblLook w:firstColumn="1" w:firstRow="1" w:lastColumn="0" w:lastRow="0" w:noHBand="0" w:noVBand="1" w:val="04A0"/>
+      </w:tblPr>
+      <w:tblGrid>
+        <w:gridCol w:w="4989"/>
+        <w:gridCol w:w="4989"/>
+      </w:tblGrid>
+      <w:tr>
+        <w:trPr>
+          <w:cantSplit/>
+        </w:trPr>
+        <w:tc>
+          <w:tcPr>
+            <w:tcW w:type="dxa" w:w="4989"/>
+            <w:shd w:fill="17304B"/>
+            <w:vAlign w:val="center"/>
+          </w:tcPr>
+          <w:p>
+            <w:pPr>
+              <w:spacing w:after="0"/>
+            </w:pPr>
+            <w:r/>
+            <w:r>
+              <w:rPr>
+                <w:b/>
+                <w:color w:val="FFFFFF"/>
+                <w:sz w:val="17"/>
+              </w:rPr>
+              <w:t>Control</w:t>
+            </w:r>
+          </w:p>
+        </w:tc>
+        <w:tc>
+          <w:tcPr>
+            <w:tcW w:type="dxa" w:w="4989"/>
+            <w:shd w:fill="17304B"/>
+            <w:vAlign w:val="center"/>
+          </w:tcPr>
+          <w:p>
+            <w:pPr>
+              <w:spacing w:after="0"/>
+            </w:pPr>
+            <w:r/>
+            <w:r>
+              <w:rPr>
+                <w:b/>
+                <w:color w:val="FFFFFF"/>
+                <w:sz w:val="17"/>
+              </w:rPr>
+              <w:t>Selected design / acceptance criterion</w:t>
+            </w:r>
+          </w:p>
+        </w:tc>
+      </w:tr>
+      <w:tr>
+        <w:trPr>
+          <w:cantSplit/>
+        </w:trPr>
+        <w:tc>
+          <w:tcPr>
+            <w:tcW w:type="dxa" w:w="4989"/>
+            <w:vAlign w:val="center"/>
+          </w:tcPr>
+          <w:p>
+            <w:pPr>
+              <w:spacing w:after="0"/>
+            </w:pPr>
+            <w:r/>
+            <w:r>
+              <w:rPr>
+                <w:b w:val="0"/>
+                <w:sz w:val="17"/>
+              </w:rPr>
+              <w:t>Structural wall</w:t>
+            </w:r>
+          </w:p>
+        </w:tc>
+        <w:tc>
+          <w:tcPr>
+            <w:tcW w:type="dxa" w:w="4989"/>
+            <w:vAlign w:val="center"/>
+          </w:tcPr>
+          <w:p>
+            <w:pPr>
+              <w:spacing w:after="0"/>
+            </w:pPr>
+            <w:r/>
+            <w:r>
+              <w:rPr>
+                <w:b w:val="0"/>
+                <w:sz w:val="17"/>
+              </w:rPr>
+              <w:t>12 mm EN AW-6082-T6 aluminium; 1.33 µm pressure-only proof deflection.</w:t>
+            </w:r>
+          </w:p>
+        </w:tc>
+      </w:tr>
+      <w:tr>
+        <w:trPr>
+          <w:cantSplit/>
+        </w:trPr>
+        <w:tc>
+          <w:tcPr>
+            <w:tcW w:type="dxa" w:w="4989"/>
+            <w:vAlign w:val="center"/>
+          </w:tcPr>
+          <w:p>
+            <w:pPr>
+              <w:spacing w:after="0"/>
+            </w:pPr>
+            <w:r/>
+            <w:r>
+              <w:rPr>
+                <w:b w:val="0"/>
+                <w:sz w:val="17"/>
+              </w:rPr>
+              <w:t>Insulating plate</w:t>
+            </w:r>
+          </w:p>
+        </w:tc>
+        <w:tc>
+          <w:tcPr>
+            <w:tcW w:type="dxa" w:w="4989"/>
+            <w:vAlign w:val="center"/>
+          </w:tcPr>
+          <w:p>
+            <w:pPr>
+              <w:spacing w:after="0"/>
+            </w:pPr>
+            <w:r/>
+            <w:r>
+              <w:rPr>
+                <w:b w:val="0"/>
+                <w:sz w:val="17"/>
+              </w:rPr>
+              <w:t>20 mm Unfilled PEEK; 4.51 µm pressure-only proof deflection.</w:t>
+            </w:r>
+          </w:p>
+        </w:tc>
+      </w:tr>
+      <w:tr>
+        <w:trPr>
+          <w:cantSplit/>
+        </w:trPr>
+        <w:tc>
+          <w:tcPr>
+            <w:tcW w:type="dxa" w:w="4989"/>
+            <w:vAlign w:val="center"/>
+          </w:tcPr>
+          <w:p>
+            <w:pPr>
+              <w:spacing w:after="0"/>
+            </w:pPr>
+            <w:r/>
+            <w:r>
+              <w:rPr>
+                <w:b w:val="0"/>
+                <w:sz w:val="17"/>
+              </w:rPr>
+              <w:t>Loaded local gap</w:t>
+            </w:r>
+          </w:p>
+        </w:tc>
+        <w:tc>
+          <w:tcPr>
+            <w:tcW w:type="dxa" w:w="4989"/>
+            <w:vAlign w:val="center"/>
+          </w:tcPr>
+          <w:p>
+            <w:pPr>
+              <w:spacing w:after="0"/>
+            </w:pPr>
+            <w:r/>
+            <w:r>
+              <w:rPr>
+                <w:b w:val="0"/>
+                <w:sz w:val="17"/>
+              </w:rPr>
+              <w:t>2.00 ± 0.02 mm with hard stops and a loaded gap map.</w:t>
+            </w:r>
+          </w:p>
+        </w:tc>
+      </w:tr>
+      <w:tr>
+        <w:trPr>
+          <w:cantSplit/>
+        </w:trPr>
+        <w:tc>
+          <w:tcPr>
+            <w:tcW w:type="dxa" w:w="4989"/>
+            <w:vAlign w:val="center"/>
+          </w:tcPr>
+          <w:p>
+            <w:pPr>
+              <w:spacing w:after="0"/>
+            </w:pPr>
+            <w:r/>
+            <w:r>
+              <w:rPr>
+                <w:b w:val="0"/>
+                <w:sz w:val="17"/>
+              </w:rPr>
+              <w:t>Wetted surfaces</w:t>
+            </w:r>
+          </w:p>
+        </w:tc>
+        <w:tc>
+          <w:tcPr>
+            <w:tcW w:type="dxa" w:w="4989"/>
+            <w:vAlign w:val="center"/>
+          </w:tcPr>
+          <w:p>
+            <w:pPr>
+              <w:spacing w:after="0"/>
+            </w:pPr>
+            <w:r/>
+            <w:r>
+              <w:rPr>
+                <w:b w:val="0"/>
+                <w:sz w:val="17"/>
+              </w:rPr>
+              <w:t>Smooth removable non-porous metal liners; exposed PEEK restricted to the insulating cartridge land.</w:t>
+            </w:r>
+          </w:p>
+        </w:tc>
+      </w:tr>
+      <w:tr>
+        <w:trPr>
+          <w:cantSplit/>
+        </w:trPr>
+        <w:tc>
+          <w:tcPr>
+            <w:tcW w:type="dxa" w:w="4989"/>
+            <w:vAlign w:val="center"/>
+          </w:tcPr>
+          <w:p>
+            <w:pPr>
+              <w:spacing w:after="0"/>
+            </w:pPr>
+            <w:r/>
+            <w:r>
+              <w:rPr>
+                <w:b w:val="0"/>
+                <w:sz w:val="17"/>
+              </w:rPr>
+              <w:t>Edge effect</w:t>
+            </w:r>
+          </w:p>
+        </w:tc>
+        <w:tc>
+          <w:tcPr>
+            <w:tcW w:type="dxa" w:w="4989"/>
+            <w:vAlign w:val="center"/>
+          </w:tcPr>
+          <w:p>
+            <w:pPr>
+              <w:spacing w:after="0"/>
+            </w:pPr>
+            <w:r/>
+            <w:r>
+              <w:rPr>
+                <w:b w:val="0"/>
+                <w:sz w:val="17"/>
+              </w:rPr>
+              <w:t>Primary 50 mm aperture plus 30/40/50 mm area–perimeter regression. A 1 mm band is already 7.84% of active area.</w:t>
+            </w:r>
+          </w:p>
+        </w:tc>
+      </w:tr>
+      <w:tr>
+        <w:trPr>
+          <w:cantSplit/>
+        </w:trPr>
+        <w:tc>
+          <w:tcPr>
+            <w:tcW w:type="dxa" w:w="4989"/>
+            <w:vAlign w:val="center"/>
+          </w:tcPr>
+          <w:p>
+            <w:pPr>
+              <w:spacing w:after="0"/>
+            </w:pPr>
+            <w:r/>
+            <w:r>
+              <w:rPr>
+                <w:b w:val="0"/>
+                <w:sz w:val="17"/>
+              </w:rPr>
+              <w:t>Wall-storage blank</w:t>
+            </w:r>
+          </w:p>
+        </w:tc>
+        <w:tc>
+          <w:tcPr>
+            <w:tcW w:type="dxa" w:w="4989"/>
+            <w:vAlign w:val="center"/>
+          </w:tcPr>
+          <w:p>
+            <w:pPr>
+              <w:spacing w:after="0"/>
+            </w:pPr>
+            <w:r/>
+            <w:r>
+              <w:rPr>
+                <w:b w:val="0"/>
+                <w:sz w:val="17"/>
+              </w:rPr>
+              <w:t>≤ 0.01733 mg per segment, equivalent to 0.256 nm reversible water film.</w:t>
+            </w:r>
+          </w:p>
+        </w:tc>
+      </w:tr>
+      <w:tr>
+        <w:trPr>
+          <w:cantSplit/>
+        </w:trPr>
+        <w:tc>
+          <w:tcPr>
+            <w:tcW w:type="dxa" w:w="4989"/>
+            <w:vAlign w:val="center"/>
+          </w:tcPr>
+          <w:p>
+            <w:pPr>
+              <w:spacing w:after="0"/>
+            </w:pPr>
+            <w:r/>
+            <w:r>
+              <w:rPr>
+                <w:b w:val="0"/>
+                <w:sz w:val="17"/>
+              </w:rPr>
+              <w:t>Sensors / mixing</w:t>
+            </w:r>
+          </w:p>
+        </w:tc>
+        <w:tc>
+          <w:tcPr>
+            <w:tcW w:type="dxa" w:w="4989"/>
+            <w:vAlign w:val="center"/>
+          </w:tcPr>
+          <w:p>
+            <w:pPr>
+              <w:spacing w:after="0"/>
+            </w:pPr>
+            <w:r/>
+            <w:r>
+              <w:rPr>
+                <w:b w:val="0"/>
+                <w:sz w:val="17"/>
+              </w:rPr>
+              <w:t>2 T/RH locations per chamber; relative calibration ≤ 0.10 RH point and spatial disagreement ≤ 0.15 RH point.</w:t>
+            </w:r>
+          </w:p>
+        </w:tc>
+      </w:tr>
+      <w:tr>
+        <w:trPr>
+          <w:cantSplit/>
+        </w:trPr>
+        <w:tc>
+          <w:tcPr>
+            <w:tcW w:type="dxa" w:w="4989"/>
+            <w:vAlign w:val="center"/>
+          </w:tcPr>
+          <w:p>
+            <w:pPr>
+              <w:spacing w:after="0"/>
+            </w:pPr>
+            <w:r/>
+            <w:r>
+              <w:rPr>
+                <w:b w:val="0"/>
+                <w:sz w:val="17"/>
+              </w:rPr>
+              <w:t>State / leakage</w:t>
+            </w:r>
+          </w:p>
+        </w:tc>
+        <w:tc>
+          <w:tcPr>
+            <w:tcW w:type="dxa" w:w="4989"/>
+            <w:vAlign w:val="center"/>
+          </w:tcPr>
+          <w:p>
+            <w:pPr>
+              <w:spacing w:after="0"/>
+            </w:pPr>
+            <w:r/>
+            <w:r>
+              <w:rPr>
+                <w:b w:val="0"/>
+                <w:sz w:val="17"/>
+              </w:rPr>
+              <w:t>Chamber ΔT ≤ 0.05 K; volume uncertainty ≤ 1.0 mL; cross-leak screen ≤ 6.25 mL/min at peak RH difference.</w:t>
+            </w:r>
+          </w:p>
+        </w:tc>
+      </w:tr>
+    </w:tbl>
+    <w:p>
+      <w:pPr>
+        <w:pStyle w:val="Heading1"/>
+        <w:keepNext/>
+      </w:pPr>
+      <w:r>
+        <w:rPr>
+          <w:color w:val="14304B"/>
+        </w:rPr>
+        <w:t>Acceptance logic</w:t>
+      </w:r>
+    </w:p>
+    <w:p>
+      <w:r>
+        <w:t>The planning root-sum-square allocation is 3.36% of the corrected segment signal. This is not demonstrated accuracy. Accept data only after individual volume calibration, pressure-decay and guard-leak testing, an impermeable-coupon wall/thermal blank, a zero-current diffusion blank, three-aperture edge regression, spatial mixing verification and post-run drift checks.</w:t>
+      </w:r>
+    </w:p>
+    <w:p>
+      <w:r>
+        <w:rPr>
+          <w:b/>
+          <w:color w:val="D97706"/>
+        </w:rPr>
+        <w:t>Wall thickness cannot eliminate membrane-edge transport or reversible water storage. These are controlled by the liner, guard, blanks and aperture regression.</w:t>
+      </w:r>
+    </w:p>
     <w:sectPr>
       <w:pgSz w:w="11906" w:h="16838"/>
       <w:pgMar w:top="794" w:right="964" w:bottom="794" w:left="964" w:header="720" w:footer="720" w:gutter="0"/>

</xml_diff>